<commit_message>
LUBE OFFICE: motor no ar, altura do editor, modelos em pt-BR e teste do motor
Teste de ponta a ponta com o motor da SRV-IA (ONLYOFFICE 10.0): abriu,
editou, fechou e a versao 2 chegou com origem "editor" e o texto escrito.
O teste achou e este commit corrige:
- editor.css: o ONLYOFFICE troca o espaco reservado pela propria moldura,
  que ficava com 150 px; .ed-area > iframe ocupa a area toda.
- Modelos: idioma pt-BR (o corretor sublinhava tudo em ingles) e
  propriedades da Lube no lugar de "python-docx", data de 2013 e
  "Microsoft Macintosh Word" (gerar_modelos.py, funcao finalizar).
Tambem: porta POST /office/motor/teste, so com senha temporaria gravada no
banco (db/06_office_teste_motor.sql), para conferir o motor depois de
instalar ou reinstalar.

Co-Authored-By: Claude Opus 5.5 <noreply@anthropic.com>
</commit_message>
<xml_diff>
--- a/office/modelos/ata-de-reuniao.docx
+++ b/office/modelos/ata-de-reuniao.docx
@@ -869,7 +869,7 @@
         <w:rFonts w:asciiTheme="minorHAnsi" w:eastAsiaTheme="minorEastAsia" w:hAnsiTheme="minorHAnsi" w:cstheme="minorBidi"/>
         <w:sz w:val="22"/>
         <w:szCs w:val="22"/>
-        <w:lang w:val="en-US" w:eastAsia="en-US" w:bidi="ar-SA"/>
+        <w:lang w:val="pt-BR" w:eastAsia="pt-BR" w:bidi="ar-SA"/>
       </w:rPr>
     </w:rPrDefault>
     <w:pPrDefault>
@@ -12723,7 +12723,7 @@
         <w:rFonts w:asciiTheme="minorHAnsi" w:eastAsiaTheme="minorEastAsia" w:hAnsiTheme="minorHAnsi" w:cstheme="minorBidi"/>
         <w:sz w:val="22"/>
         <w:szCs w:val="22"/>
-        <w:lang w:val="en-US" w:eastAsia="en-US" w:bidi="ar-SA"/>
+        <w:lang w:val="pt-BR" w:eastAsia="pt-BR" w:bidi="ar-SA"/>
       </w:rPr>
     </w:rPrDefault>
     <w:pPrDefault>

</xml_diff>